<commit_message>
Update CNN model architecture and training scripts; improve evaluation metrics and documentation
</commit_message>
<xml_diff>
--- a/report_filled.docx
+++ b/report_filled.docx
@@ -729,7 +729,7 @@
         <w:rPr>
           <w:color w:val="FF0000"/>
         </w:rPr>
-        <w:t>Report of results: Table 1 (Test metrics) - Model | Acc | Prec | Rec | F1. CNN | 0.9278 | 0.9085 | 0.9214 | 0.9149. ResNet18 | 0.9754 | 0.9764 | 0.9743 | 0.9754.</w:t>
+        <w:t>Report of results: Table 1 (Test metrics) - Model | Acc | Prec | Rec | F1. CNN | 0.9666 | 0.9760 | 0.9440 | 0.9597. ResNet18 | 0.9754 | 0.9764 | 0.9743 | 0.9754.</w:t>
       </w:r>
     </w:p>
     <w:p>
@@ -858,7 +858,7 @@
         <w:pStyle w:val="references"/>
       </w:pPr>
       <w:r>
-        <w:t xml:space="preserve">Kaggle, "140K Real and Fake Faces" dataset, 2019. </w:t>
+        <w:t xml:space="preserve">Kaggle, "140K Real and Fake Faces" dataset, 2019. Kaggle, "Real vs AI-Generated Faces" dataset (philosopher0808), https://www.kaggle.com/datasets/philosopher0808/real-vs-ai-generated-faces-dataset/data. </w:t>
       </w:r>
       <w:r>
         <w:rPr>

</xml_diff>